<commit_message>
Przejście z C++ na Pythona w dziale algorytmiki (1TT)
Rozkład i plan wynikowy wydawnictwa są pisane pod C++. Zapisy odwołujące
się do konstrukcji tego języka przeniesiono na realia Pythona: typ int bez
ograniczenia zakresu zamiast short/long/unsigned, typ str z funkcjami ord
i chr zamiast char, metody napisów zamiast toupper i substr, funkcja
niezwracająca wartości zamiast typu void, przekazywanie przez odwołanie do
obiektu zamiast przez wartość. Cel dydaktyczny każdego wymagania bez zmian.

Co-Authored-By: Claude Opus 5 <noreply@anthropic.com>
Claude-Session: https://claude.ai/code/session_01J1ZgJDNdJRkZpjyGHfQDnK
</commit_message>
<xml_diff>
--- a/docs/pliki/wymagania-edukacyjne-1tt.docx
+++ b/docs/pliki/wymagania-edukacyjne-1tt.docx
@@ -201,7 +201,7 @@
           <w:sz w:val="21"/>
           <w:szCs w:val="21"/>
         </w:rPr>
-        <w:t xml:space="preserve">ćwiczenia i zadania praktyczne wykonywane przy komputerze, w tym programy w języku C++;</w:t>
+        <w:t xml:space="preserve">ćwiczenia i zadania praktyczne wykonywane przy komputerze, w tym programy w języku Python;</w:t>
       </w:r>
     </w:p>
     <w:p>
@@ -953,7 +953,7 @@
                 <w:sz w:val="20"/>
                 <w:szCs w:val="20"/>
               </w:rPr>
-              <w:t xml:space="preserve">Algorytmika i programowanie w języku C++</w:t>
+              <w:t xml:space="preserve">Algorytmika i programowanie w języku Python</w:t>
             </w:r>
           </w:p>
         </w:tc>
@@ -9827,7 +9827,7 @@
           <w:sz w:val="24"/>
           <w:szCs w:val="24"/>
         </w:rPr>
-        <w:t xml:space="preserve">Dział VI. Algorytmika i programowanie w języku C++</w:t>
+        <w:t xml:space="preserve">Dział VI. Algorytmika i programowanie w języku Python</w:t>
       </w:r>
     </w:p>
     <w:p>
@@ -10966,7 +10966,7 @@
                 <w:sz w:val="20"/>
                 <w:szCs w:val="20"/>
               </w:rPr>
-              <w:t xml:space="preserve">stosuje w języku C++ podstawowe konstrukcje programistyczne: operacje wejścia i wyjścia, instrukcję warunkową, operatory matematyczne i logiczne</w:t>
+              <w:t xml:space="preserve">stosuje w języku Python podstawowe konstrukcje programistyczne: wczytywanie i wypisywanie danych, instrukcję warunkową, operatory matematyczne i logiczne</w:t>
             </w:r>
           </w:p>
           <w:p>
@@ -11191,7 +11191,7 @@
                 <w:sz w:val="20"/>
                 <w:szCs w:val="20"/>
               </w:rPr>
-              <w:t xml:space="preserve">tworzy w języku C++ programy wykonujące działania na liczbach całkowitych</w:t>
+              <w:t xml:space="preserve">tworzy w języku Python programy wykonujące działania na liczbach całkowitych</w:t>
             </w:r>
           </w:p>
           <w:p>
@@ -11227,25 +11227,25 @@
                 <w:sz w:val="20"/>
                 <w:szCs w:val="20"/>
               </w:rPr>
-              <w:t xml:space="preserve">omawia sposób reprezentowania liczb całkowitych w komputerze, wymienia i stosuje typy danych służące do ich zapisu (short int, int, long int, long long int, unsigned)</w:t>
-            </w:r>
-          </w:p>
-          <w:p>
-            <w:pPr>
-              <w:pStyle w:val="ListParagraph"/>
-              <w:numPr>
-                <w:ilvl w:val="0"/>
-                <w:numId w:val="2"/>
-              </w:numPr>
-              <w:spacing w:after="40" w:line="252"/>
-            </w:pPr>
-            <w:r>
-              <w:rPr>
-                <w:rFonts w:ascii="Calibri" w:cs="Calibri" w:eastAsia="Calibri" w:hAnsi="Calibri"/>
-                <w:sz w:val="20"/>
-                <w:szCs w:val="20"/>
-              </w:rPr>
-              <w:t xml:space="preserve">opisuje reprezentację znaków i napisów (char, string), odwołuje się do znaku w napisie za pomocą indeksu, wyjaśnia, czym jest tablica kodów ASCII</w:t>
+              <w:t xml:space="preserve">omawia sposób reprezentowania liczb całkowitych w komputerze i wyjaśnia, czym różni się typ int w Pythonie, o nieograniczonym zakresie, od typów o stałej długości używanych w innych językach</w:t>
+            </w:r>
+          </w:p>
+          <w:p>
+            <w:pPr>
+              <w:pStyle w:val="ListParagraph"/>
+              <w:numPr>
+                <w:ilvl w:val="0"/>
+                <w:numId w:val="2"/>
+              </w:numPr>
+              <w:spacing w:after="40" w:line="252"/>
+            </w:pPr>
+            <w:r>
+              <w:rPr>
+                <w:rFonts w:ascii="Calibri" w:cs="Calibri" w:eastAsia="Calibri" w:hAnsi="Calibri"/>
+                <w:sz w:val="20"/>
+                <w:szCs w:val="20"/>
+              </w:rPr>
+              <w:t xml:space="preserve">opisuje reprezentację znaków i napisów (typ str), odwołuje się do znaku w napisie za pomocą indeksu, wyjaśnia, czym jest tablica kodów ASCII, i stosuje funkcje ord oraz chr</w:t>
             </w:r>
           </w:p>
           <w:p>
@@ -11299,25 +11299,25 @@
                 <w:sz w:val="20"/>
                 <w:szCs w:val="20"/>
               </w:rPr>
-              <w:t xml:space="preserve">wykonuje operacje na napisach: wczytuje napisy ze spacjami, sprawdza długość napisu, zamienia wielkość liter, porównuje znaki, znajduje i usuwa fragmenty napisów</w:t>
-            </w:r>
-          </w:p>
-          <w:p>
-            <w:pPr>
-              <w:pStyle w:val="ListParagraph"/>
-              <w:numPr>
-                <w:ilvl w:val="0"/>
-                <w:numId w:val="2"/>
-              </w:numPr>
-              <w:spacing w:after="40" w:line="252"/>
-            </w:pPr>
-            <w:r>
-              <w:rPr>
-                <w:rFonts w:ascii="Calibri" w:cs="Calibri" w:eastAsia="Calibri" w:hAnsi="Calibri"/>
-                <w:sz w:val="20"/>
-                <w:szCs w:val="20"/>
-              </w:rPr>
-              <w:t xml:space="preserve">definiuje własne funkcje w języku C++, wyjaśnia celowość ich stosowania, rozróżnia parametry formalne i aktualne</w:t>
+              <w:t xml:space="preserve">wykonuje operacje na napisach: wczytuje napisy ze spacjami, sprawdza długość napisu, zamienia wielkość liter, porównuje znaki, wycina i zastępuje fragmenty napisów</w:t>
+            </w:r>
+          </w:p>
+          <w:p>
+            <w:pPr>
+              <w:pStyle w:val="ListParagraph"/>
+              <w:numPr>
+                <w:ilvl w:val="0"/>
+                <w:numId w:val="2"/>
+              </w:numPr>
+              <w:spacing w:after="40" w:line="252"/>
+            </w:pPr>
+            <w:r>
+              <w:rPr>
+                <w:rFonts w:ascii="Calibri" w:cs="Calibri" w:eastAsia="Calibri" w:hAnsi="Calibri"/>
+                <w:sz w:val="20"/>
+                <w:szCs w:val="20"/>
+              </w:rPr>
+              <w:t xml:space="preserve">definiuje własne funkcje w języku Python, wyjaśnia celowość ich stosowania, rozróżnia parametry formalne i aktualne</w:t>
             </w:r>
           </w:p>
           <w:p>
@@ -11371,7 +11371,7 @@
                 <w:sz w:val="20"/>
                 <w:szCs w:val="20"/>
               </w:rPr>
-              <w:t xml:space="preserve">pisze program realizujący algorytm Euklidesa w wersjach z dzieleniem i odejmowaniem, stosując funkcję typu void</w:t>
+              <w:t xml:space="preserve">pisze program realizujący algorytm Euklidesa w wersjach z dzieleniem i odejmowaniem, stosując funkcję niezwracającą wartości</w:t>
             </w:r>
           </w:p>
           <w:p>
@@ -11540,43 +11540,43 @@
                 <w:sz w:val="20"/>
                 <w:szCs w:val="20"/>
               </w:rPr>
-              <w:t xml:space="preserve">realizuje w języku C++ algorytmy sprawdzające, czy dany napis jest palindromem, oraz wyszukujące palindromy w zdaniach</w:t>
-            </w:r>
-          </w:p>
-          <w:p>
-            <w:pPr>
-              <w:pStyle w:val="ListParagraph"/>
-              <w:numPr>
-                <w:ilvl w:val="0"/>
-                <w:numId w:val="2"/>
-              </w:numPr>
-              <w:spacing w:after="40" w:line="252"/>
-            </w:pPr>
-            <w:r>
-              <w:rPr>
-                <w:rFonts w:ascii="Calibri" w:cs="Calibri" w:eastAsia="Calibri" w:hAnsi="Calibri"/>
-                <w:sz w:val="20"/>
-                <w:szCs w:val="20"/>
-              </w:rPr>
-              <w:t xml:space="preserve">opisuje i stosuje popularne funkcje oraz metody dla zmiennych typu string (toupper, tolower, size, substr, erase)</w:t>
-            </w:r>
-          </w:p>
-          <w:p>
-            <w:pPr>
-              <w:pStyle w:val="ListParagraph"/>
-              <w:numPr>
-                <w:ilvl w:val="0"/>
-                <w:numId w:val="2"/>
-              </w:numPr>
-              <w:spacing w:after="40" w:line="252"/>
-            </w:pPr>
-            <w:r>
-              <w:rPr>
-                <w:rFonts w:ascii="Calibri" w:cs="Calibri" w:eastAsia="Calibri" w:hAnsi="Calibri"/>
-                <w:sz w:val="20"/>
-                <w:szCs w:val="20"/>
-              </w:rPr>
-              <w:t xml:space="preserve">wykonuje obliczenia na dowolnie dużych liczbach, wykorzystując napisy; wyjaśnia różnicę między operacjami na liczbach o podstawie od 1 do 9 i większej od 10</w:t>
+              <w:t xml:space="preserve">realizuje w języku Python algorytmy sprawdzające, czy dany napis jest palindromem, oraz wyszukujące palindromy w zdaniach</w:t>
+            </w:r>
+          </w:p>
+          <w:p>
+            <w:pPr>
+              <w:pStyle w:val="ListParagraph"/>
+              <w:numPr>
+                <w:ilvl w:val="0"/>
+                <w:numId w:val="2"/>
+              </w:numPr>
+              <w:spacing w:after="40" w:line="252"/>
+            </w:pPr>
+            <w:r>
+              <w:rPr>
+                <w:rFonts w:ascii="Calibri" w:cs="Calibri" w:eastAsia="Calibri" w:hAnsi="Calibri"/>
+                <w:sz w:val="20"/>
+                <w:szCs w:val="20"/>
+              </w:rPr>
+              <w:t xml:space="preserve">opisuje i stosuje popularne metody napisów (upper, lower, len, wycinki, replace, find)</w:t>
+            </w:r>
+          </w:p>
+          <w:p>
+            <w:pPr>
+              <w:pStyle w:val="ListParagraph"/>
+              <w:numPr>
+                <w:ilvl w:val="0"/>
+                <w:numId w:val="2"/>
+              </w:numPr>
+              <w:spacing w:after="40" w:line="252"/>
+            </w:pPr>
+            <w:r>
+              <w:rPr>
+                <w:rFonts w:ascii="Calibri" w:cs="Calibri" w:eastAsia="Calibri" w:hAnsi="Calibri"/>
+                <w:sz w:val="20"/>
+                <w:szCs w:val="20"/>
+              </w:rPr>
+              <w:t xml:space="preserve">wykonuje obliczenia na dowolnie dużych liczbach zapisanych jako napisy i porównuje własną implementację z wbudowanym typem int, który w Pythonie nie ma ograniczenia zakresu</w:t>
             </w:r>
           </w:p>
           <w:p>
@@ -11612,25 +11612,25 @@
                 <w:sz w:val="20"/>
                 <w:szCs w:val="20"/>
               </w:rPr>
-              <w:t xml:space="preserve">stosuje strukturę do reprezentacji liczb wymiernych i wykorzystuje algorytm Euklidesa do działań na ułamkach</w:t>
-            </w:r>
-          </w:p>
-          <w:p>
-            <w:pPr>
-              <w:pStyle w:val="ListParagraph"/>
-              <w:numPr>
-                <w:ilvl w:val="0"/>
-                <w:numId w:val="2"/>
-              </w:numPr>
-              <w:spacing w:after="40" w:line="252"/>
-            </w:pPr>
-            <w:r>
-              <w:rPr>
-                <w:rFonts w:ascii="Calibri" w:cs="Calibri" w:eastAsia="Calibri" w:hAnsi="Calibri"/>
-                <w:sz w:val="20"/>
-                <w:szCs w:val="20"/>
-              </w:rPr>
-              <w:t xml:space="preserve">stosuje zmienne lokalne i globalne oraz przekazywanie parametrów przez wartość</w:t>
+              <w:t xml:space="preserve">stosuje krotkę lub własną klasę do reprezentacji liczb wymiernych i wykorzystuje algorytm Euklidesa do działań na ułamkach; porównuje wynik z modułem fractions</w:t>
+            </w:r>
+          </w:p>
+          <w:p>
+            <w:pPr>
+              <w:pStyle w:val="ListParagraph"/>
+              <w:numPr>
+                <w:ilvl w:val="0"/>
+                <w:numId w:val="2"/>
+              </w:numPr>
+              <w:spacing w:after="40" w:line="252"/>
+            </w:pPr>
+            <w:r>
+              <w:rPr>
+                <w:rFonts w:ascii="Calibri" w:cs="Calibri" w:eastAsia="Calibri" w:hAnsi="Calibri"/>
+                <w:sz w:val="20"/>
+                <w:szCs w:val="20"/>
+              </w:rPr>
+              <w:t xml:space="preserve">stosuje zmienne lokalne i globalne, wyjaśnia, że argumenty przekazywane są przez odwołanie do obiektu, i przewiduje skutki modyfikowania obiektu zmiennego wewnątrz funkcji</w:t>
             </w:r>
           </w:p>
           <w:p>

</xml_diff>